<commit_message>
Layout dynamic edit and resizing feature
</commit_message>
<xml_diff>
--- a/output/Test_Magazine_Student_Section.docx
+++ b/output/Test_Magazine_Student_Section.docx
@@ -5,411 +5,1937 @@
     <w:p>
       <w:pPr>
         <w:pageBreakBefore w:val="0"/>
+        <w:pBdr>
+          <w:top w:val="single" w:sz="36" w:space="6" w:color="1F4E78"/>
+          <w:bottom w:val="single" w:sz="12" w:space="4" w:color="1F4E78"/>
+        </w:pBdr>
         <w:tabs>
           <w:tab w:pos="9029" w:val="right"/>
         </w:tabs>
         <w:spacing w:after="320"/>
-        <w:pBdr>
-          <w:top w:val="single" w:sz="36" w:space="6" w:color="1F4E78"/>
-          <w:bottom w:val="single" w:sz="12" w:space="4" w:color="1F4E78"/>
-        </w:pBdr>
       </w:pPr>
       <w:r>
         <w:rPr>
           <w:b/>
           <w:color w:val="1F4E78"/>
+          <w:spacing w:val="30"/>
           <w:sz w:val="17"/>
-          <w:spacing w:val="30"/>
         </w:rPr>
         <w:t>IT CHRONICLES · STUDENT ACHIEVEMENTS</w:t>
       </w:r>
     </w:p>
+    <w:tbl>
+      <w:tblPr>
+        <w:tblW w:type="auto" w:w="0"/>
+        <w:jc w:val="left"/>
+        <w:tblLayout w:type="fixed"/>
+        <w:tblLook w:firstColumn="1" w:firstRow="1" w:lastColumn="0" w:lastRow="0" w:noHBand="0" w:noVBand="1" w:val="04A0"/>
+      </w:tblPr>
+      <w:tblGrid>
+        <w:gridCol w:w="752"/>
+        <w:gridCol w:w="752"/>
+        <w:gridCol w:w="752"/>
+        <w:gridCol w:w="752"/>
+        <w:gridCol w:w="752"/>
+        <w:gridCol w:w="752"/>
+        <w:gridCol w:w="752"/>
+        <w:gridCol w:w="752"/>
+        <w:gridCol w:w="752"/>
+        <w:gridCol w:w="752"/>
+        <w:gridCol w:w="752"/>
+        <w:gridCol w:w="752"/>
+      </w:tblGrid>
+      <w:tr>
+        <w:trPr>
+          <w:trHeight w:val="420" w:hRule="atLeast"/>
+        </w:trPr>
+        <w:tc>
+          <w:tcPr>
+            <w:tcW w:type="dxa" w:w="9024"/>
+            <w:gridSpan w:val="12"/>
+            <w:tcMar>
+              <w:top w:w="20" w:type="dxa"/>
+              <w:left w:w="60" w:type="dxa"/>
+              <w:bottom w:w="20" w:type="dxa"/>
+              <w:right w:w="60" w:type="dxa"/>
+            </w:tcMar>
+            <w:vAlign w:val="top"/>
+          </w:tcPr>
+          <w:p>
+            <w:pPr>
+              <w:spacing w:after="0"/>
+              <w:jc w:val="left"/>
+            </w:pPr>
+            <w:r>
+              <w:rPr>
+                <w:b/>
+                <w:i w:val="0"/>
+                <w:color w:val="FFFFFF"/>
+                <w:sz w:val="16"/>
+                <w:shd w:val="clear" w:color="auto" w:fill="1F4E78"/>
+              </w:rPr>
+              <w:t xml:space="preserve">  1ST PRIZE CHAMPIONS  </w:t>
+            </w:r>
+          </w:p>
+        </w:tc>
+      </w:tr>
+      <w:tr>
+        <w:trPr>
+          <w:trHeight w:val="420" w:hRule="atLeast"/>
+        </w:trPr>
+        <w:tc>
+          <w:tcPr>
+            <w:tcW w:type="dxa" w:w="9024"/>
+            <w:gridSpan w:val="12"/>
+            <w:vMerge w:val="restart"/>
+            <w:tcMar>
+              <w:top w:w="20" w:type="dxa"/>
+              <w:left w:w="60" w:type="dxa"/>
+              <w:bottom w:w="20" w:type="dxa"/>
+              <w:right w:w="60" w:type="dxa"/>
+            </w:tcMar>
+            <w:vAlign w:val="top"/>
+          </w:tcPr>
+          <w:p>
+            <w:pPr>
+              <w:spacing w:line="288" w:lineRule="auto" w:after="0"/>
+              <w:jc w:val="left"/>
+            </w:pPr>
+            <w:r>
+              <w:rPr>
+                <w:b/>
+                <w:i w:val="0"/>
+                <w:color w:val="1F4E78"/>
+                <w:sz w:val="34"/>
+              </w:rPr>
+              <w:t>Global Smart Cities Hackathon Championship 2026</w:t>
+            </w:r>
+          </w:p>
+        </w:tc>
+      </w:tr>
+      <w:tr>
+        <w:trPr>
+          <w:trHeight w:val="420" w:hRule="atLeast"/>
+        </w:trPr>
+        <w:tc>
+          <w:tcPr>
+            <w:tcW w:type="dxa" w:w="9024"/>
+            <w:gridSpan w:val="12"/>
+            <w:vMerge/>
+          </w:tcPr>
+          <w:p/>
+        </w:tc>
+      </w:tr>
+      <w:tr>
+        <w:trPr>
+          <w:trHeight w:val="420" w:hRule="atLeast"/>
+        </w:trPr>
+        <w:tc>
+          <w:tcPr>
+            <w:tcW w:type="dxa" w:w="9024"/>
+            <w:gridSpan w:val="12"/>
+            <w:vMerge/>
+          </w:tcPr>
+          <w:p/>
+        </w:tc>
+      </w:tr>
+      <w:tr>
+        <w:trPr>
+          <w:trHeight w:val="420" w:hRule="atLeast"/>
+        </w:trPr>
+        <w:tc>
+          <w:tcPr>
+            <w:tcW w:type="dxa" w:w="9024"/>
+            <w:gridSpan w:val="12"/>
+            <w:tcMar>
+              <w:top w:w="20" w:type="dxa"/>
+              <w:left w:w="60" w:type="dxa"/>
+              <w:bottom w:w="20" w:type="dxa"/>
+              <w:right w:w="60" w:type="dxa"/>
+            </w:tcMar>
+            <w:vAlign w:val="top"/>
+          </w:tcPr>
+          <w:p>
+            <w:pPr>
+              <w:spacing w:after="0"/>
+              <w:jc w:val="left"/>
+            </w:pPr>
+            <w:r>
+              <w:rPr>
+                <w:b/>
+                <w:i w:val="0"/>
+                <w:color w:val="475569"/>
+                <w:sz w:val="21"/>
+              </w:rPr>
+              <w:t>By Rohan Sharma, Anita Roy, Kevin Patel</w:t>
+            </w:r>
+          </w:p>
+        </w:tc>
+      </w:tr>
+      <w:tr>
+        <w:trPr>
+          <w:trHeight w:val="420" w:hRule="atLeast"/>
+        </w:trPr>
+        <w:tc>
+          <w:tcPr>
+            <w:tcW w:type="dxa" w:w="9024"/>
+            <w:gridSpan w:val="12"/>
+            <w:vMerge w:val="restart"/>
+            <w:tcMar>
+              <w:top w:w="20" w:type="dxa"/>
+              <w:left w:w="60" w:type="dxa"/>
+              <w:bottom w:w="20" w:type="dxa"/>
+              <w:right w:w="60" w:type="dxa"/>
+            </w:tcMar>
+            <w:vAlign w:val="top"/>
+          </w:tcPr>
+          <w:p>
+            <w:pPr>
+              <w:spacing w:after="0"/>
+              <w:jc w:val="left"/>
+            </w:pPr>
+            <w:r>
+              <w:drawing>
+                <wp:inline xmlns:a="http://schemas.openxmlformats.org/drawingml/2006/main" xmlns:pic="http://schemas.openxmlformats.org/drawingml/2006/picture">
+                  <wp:extent cx="5660136" cy="2971571"/>
+                  <wp:docPr id="1" name="Picture 1"/>
+                  <wp:cNvGraphicFramePr>
+                    <a:graphicFrameLocks noChangeAspect="1"/>
+                  </wp:cNvGraphicFramePr>
+                  <a:graphic>
+                    <a:graphicData uri="http://schemas.openxmlformats.org/drawingml/2006/picture">
+                      <pic:pic>
+                        <pic:nvPicPr>
+                          <pic:cNvPr id="0" name="crop_9c3c71f6317d4368a30494a075c0c3fa.jpg"/>
+                          <pic:cNvPicPr/>
+                        </pic:nvPicPr>
+                        <pic:blipFill>
+                          <a:blip r:embed="rId9"/>
+                          <a:stretch>
+                            <a:fillRect/>
+                          </a:stretch>
+                        </pic:blipFill>
+                        <pic:spPr>
+                          <a:xfrm>
+                            <a:off x="0" y="0"/>
+                            <a:ext cx="5660136" cy="2971571"/>
+                          </a:xfrm>
+                          <a:prstGeom prst="rect"/>
+                        </pic:spPr>
+                      </pic:pic>
+                    </a:graphicData>
+                  </a:graphic>
+                </wp:inline>
+              </w:drawing>
+            </w:r>
+          </w:p>
+          <w:p>
+            <w:pPr>
+              <w:shd w:val="clear" w:color="auto" w:fill="F8FAFC"/>
+              <w:spacing w:after="0"/>
+            </w:pPr>
+            <w:r>
+              <w:rPr>
+                <w:b w:val="0"/>
+                <w:i/>
+                <w:color w:val="64748B"/>
+                <w:sz w:val="18"/>
+              </w:rPr>
+              <w:t xml:space="preserve"> Left to Right: Rohan Sharma, Anita Roy, Kevin Patel with 1st Prize trophy</w:t>
+            </w:r>
+          </w:p>
+        </w:tc>
+      </w:tr>
+      <w:tr>
+        <w:trPr>
+          <w:trHeight w:val="420" w:hRule="atLeast"/>
+        </w:trPr>
+        <w:tc>
+          <w:tcPr>
+            <w:tcW w:type="dxa" w:w="9024"/>
+            <w:gridSpan w:val="12"/>
+            <w:vMerge/>
+          </w:tcPr>
+          <w:p/>
+        </w:tc>
+      </w:tr>
+      <w:tr>
+        <w:trPr>
+          <w:trHeight w:val="420" w:hRule="atLeast"/>
+        </w:trPr>
+        <w:tc>
+          <w:tcPr>
+            <w:tcW w:type="dxa" w:w="9024"/>
+            <w:gridSpan w:val="12"/>
+            <w:vMerge/>
+          </w:tcPr>
+          <w:p/>
+        </w:tc>
+      </w:tr>
+      <w:tr>
+        <w:trPr>
+          <w:trHeight w:val="420" w:hRule="atLeast"/>
+        </w:trPr>
+        <w:tc>
+          <w:tcPr>
+            <w:tcW w:type="dxa" w:w="9024"/>
+            <w:gridSpan w:val="12"/>
+            <w:vMerge/>
+          </w:tcPr>
+          <w:p/>
+        </w:tc>
+      </w:tr>
+      <w:tr>
+        <w:trPr>
+          <w:trHeight w:val="420" w:hRule="atLeast"/>
+        </w:trPr>
+        <w:tc>
+          <w:tcPr>
+            <w:tcW w:type="dxa" w:w="9024"/>
+            <w:gridSpan w:val="12"/>
+            <w:vMerge/>
+          </w:tcPr>
+          <w:p/>
+        </w:tc>
+      </w:tr>
+      <w:tr>
+        <w:trPr>
+          <w:trHeight w:val="420" w:hRule="atLeast"/>
+        </w:trPr>
+        <w:tc>
+          <w:tcPr>
+            <w:tcW w:type="dxa" w:w="9024"/>
+            <w:gridSpan w:val="12"/>
+            <w:vMerge/>
+          </w:tcPr>
+          <w:p/>
+        </w:tc>
+      </w:tr>
+      <w:tr>
+        <w:trPr>
+          <w:trHeight w:val="420" w:hRule="atLeast"/>
+        </w:trPr>
+        <w:tc>
+          <w:tcPr>
+            <w:tcW w:type="dxa" w:w="9024"/>
+            <w:gridSpan w:val="12"/>
+            <w:vMerge/>
+          </w:tcPr>
+          <w:p/>
+        </w:tc>
+      </w:tr>
+      <w:tr>
+        <w:trPr>
+          <w:trHeight w:val="420" w:hRule="atLeast"/>
+        </w:trPr>
+        <w:tc>
+          <w:tcPr>
+            <w:tcW w:type="dxa" w:w="9024"/>
+            <w:gridSpan w:val="12"/>
+            <w:vMerge/>
+          </w:tcPr>
+          <w:p/>
+        </w:tc>
+      </w:tr>
+      <w:tr>
+        <w:trPr>
+          <w:trHeight w:val="420" w:hRule="atLeast"/>
+        </w:trPr>
+        <w:tc>
+          <w:tcPr>
+            <w:tcW w:type="dxa" w:w="9024"/>
+            <w:gridSpan w:val="12"/>
+            <w:vMerge/>
+          </w:tcPr>
+          <w:p/>
+        </w:tc>
+      </w:tr>
+      <w:tr>
+        <w:trPr>
+          <w:trHeight w:val="420" w:hRule="atLeast"/>
+        </w:trPr>
+        <w:tc>
+          <w:tcPr>
+            <w:tcW w:type="dxa" w:w="9024"/>
+            <w:gridSpan w:val="12"/>
+            <w:vMerge/>
+          </w:tcPr>
+          <w:p/>
+        </w:tc>
+      </w:tr>
+      <w:tr>
+        <w:trPr>
+          <w:trHeight w:val="420" w:hRule="atLeast"/>
+        </w:trPr>
+        <w:tc>
+          <w:tcPr>
+            <w:tcW w:type="dxa" w:w="9024"/>
+            <w:gridSpan w:val="12"/>
+            <w:vMerge/>
+          </w:tcPr>
+          <w:p/>
+        </w:tc>
+      </w:tr>
+      <w:tr>
+        <w:trPr>
+          <w:trHeight w:val="420" w:hRule="atLeast"/>
+        </w:trPr>
+        <w:tc>
+          <w:tcPr>
+            <w:tcW w:type="dxa" w:w="9024"/>
+            <w:gridSpan w:val="12"/>
+            <w:vMerge/>
+          </w:tcPr>
+          <w:p/>
+        </w:tc>
+      </w:tr>
+      <w:tr>
+        <w:trPr>
+          <w:trHeight w:val="420" w:hRule="atLeast"/>
+        </w:trPr>
+        <w:tc>
+          <w:tcPr>
+            <w:tcW w:type="dxa" w:w="9024"/>
+            <w:gridSpan w:val="12"/>
+            <w:vMerge w:val="restart"/>
+            <w:tcMar>
+              <w:top w:w="20" w:type="dxa"/>
+              <w:left w:w="60" w:type="dxa"/>
+              <w:bottom w:w="20" w:type="dxa"/>
+              <w:right w:w="60" w:type="dxa"/>
+            </w:tcMar>
+            <w:vAlign w:val="top"/>
+          </w:tcPr>
+          <w:p>
+            <w:pPr>
+              <w:spacing w:line="360" w:lineRule="auto" w:after="0"/>
+              <w:jc w:val="left"/>
+            </w:pPr>
+            <w:r>
+              <w:rPr>
+                <w:b w:val="0"/>
+                <w:i w:val="0"/>
+                <w:color w:val="334155"/>
+                <w:sz w:val="21"/>
+              </w:rPr>
+              <w:t>Built an autonomous drone dispatch platform for disaster relief operations.</w:t>
+            </w:r>
+          </w:p>
+        </w:tc>
+      </w:tr>
+      <w:tr>
+        <w:trPr>
+          <w:trHeight w:val="420" w:hRule="atLeast"/>
+        </w:trPr>
+        <w:tc>
+          <w:tcPr>
+            <w:tcW w:type="dxa" w:w="9024"/>
+            <w:gridSpan w:val="12"/>
+            <w:vMerge/>
+          </w:tcPr>
+          <w:p/>
+        </w:tc>
+      </w:tr>
+      <w:tr>
+        <w:trPr>
+          <w:trHeight w:val="420" w:hRule="atLeast"/>
+        </w:trPr>
+        <w:tc>
+          <w:tcPr>
+            <w:tcW w:type="dxa" w:w="9024"/>
+            <w:gridSpan w:val="12"/>
+            <w:vMerge/>
+          </w:tcPr>
+          <w:p/>
+        </w:tc>
+      </w:tr>
+      <w:tr>
+        <w:trPr>
+          <w:trHeight w:val="420" w:hRule="atLeast"/>
+        </w:trPr>
+        <w:tc>
+          <w:tcPr>
+            <w:tcW w:type="dxa" w:w="9024"/>
+            <w:gridSpan w:val="12"/>
+            <w:vMerge/>
+          </w:tcPr>
+          <w:p/>
+        </w:tc>
+      </w:tr>
+      <w:tr>
+        <w:trPr>
+          <w:trHeight w:val="420" w:hRule="atLeast"/>
+        </w:trPr>
+        <w:tc>
+          <w:tcPr>
+            <w:tcW w:type="dxa" w:w="9024"/>
+            <w:gridSpan w:val="12"/>
+            <w:vMerge/>
+          </w:tcPr>
+          <w:p/>
+        </w:tc>
+      </w:tr>
+      <w:tr>
+        <w:trPr>
+          <w:trHeight w:val="420" w:hRule="atLeast"/>
+        </w:trPr>
+        <w:tc>
+          <w:tcPr>
+            <w:tcW w:type="dxa" w:w="9024"/>
+            <w:gridSpan w:val="12"/>
+            <w:vMerge/>
+          </w:tcPr>
+          <w:p/>
+        </w:tc>
+      </w:tr>
+      <w:tr>
+        <w:trPr>
+          <w:trHeight w:val="420" w:hRule="atLeast"/>
+        </w:trPr>
+        <w:tc>
+          <w:tcPr>
+            <w:tcW w:type="dxa" w:w="4512"/>
+            <w:gridSpan w:val="6"/>
+            <w:vMerge w:val="restart"/>
+            <w:tcMar>
+              <w:top w:w="20" w:type="dxa"/>
+              <w:left w:w="60" w:type="dxa"/>
+              <w:bottom w:w="20" w:type="dxa"/>
+              <w:right w:w="60" w:type="dxa"/>
+            </w:tcMar>
+            <w:vAlign w:val="top"/>
+          </w:tcPr>
+          <w:p>
+            <w:pPr>
+              <w:spacing w:after="0"/>
+              <w:jc w:val="left"/>
+            </w:pPr>
+            <w:hyperlink r:id="rId10">
+              <w:r>
+                <w:rPr>
+                  <w:b/>
+                  <w:color w:val="FFFFFF"/>
+                  <w:sz w:val="19"/>
+                  <w:shd w:val="clear" w:color="auto" w:fill="1F4E78"/>
+                </w:rPr>
+                <w:t xml:space="preserve">   View details   </w:t>
+              </w:r>
+            </w:hyperlink>
+          </w:p>
+        </w:tc>
+        <w:tc>
+          <w:tcPr>
+            <w:tcW w:type="dxa" w:w="752"/>
+          </w:tcPr>
+          <w:p/>
+        </w:tc>
+        <w:tc>
+          <w:tcPr>
+            <w:tcW w:type="dxa" w:w="752"/>
+          </w:tcPr>
+          <w:p/>
+        </w:tc>
+        <w:tc>
+          <w:tcPr>
+            <w:tcW w:type="dxa" w:w="752"/>
+          </w:tcPr>
+          <w:p/>
+        </w:tc>
+        <w:tc>
+          <w:tcPr>
+            <w:tcW w:type="dxa" w:w="752"/>
+          </w:tcPr>
+          <w:p/>
+        </w:tc>
+        <w:tc>
+          <w:tcPr>
+            <w:tcW w:type="dxa" w:w="752"/>
+          </w:tcPr>
+          <w:p/>
+        </w:tc>
+        <w:tc>
+          <w:tcPr>
+            <w:tcW w:type="dxa" w:w="752"/>
+          </w:tcPr>
+          <w:p/>
+        </w:tc>
+      </w:tr>
+      <w:tr>
+        <w:trPr>
+          <w:trHeight w:val="420" w:hRule="atLeast"/>
+        </w:trPr>
+        <w:tc>
+          <w:tcPr>
+            <w:tcW w:type="dxa" w:w="4512"/>
+            <w:gridSpan w:val="6"/>
+            <w:vMerge/>
+          </w:tcPr>
+          <w:p/>
+        </w:tc>
+        <w:tc>
+          <w:tcPr>
+            <w:tcW w:type="dxa" w:w="752"/>
+          </w:tcPr>
+          <w:p/>
+        </w:tc>
+        <w:tc>
+          <w:tcPr>
+            <w:tcW w:type="dxa" w:w="752"/>
+          </w:tcPr>
+          <w:p/>
+        </w:tc>
+        <w:tc>
+          <w:tcPr>
+            <w:tcW w:type="dxa" w:w="752"/>
+          </w:tcPr>
+          <w:p/>
+        </w:tc>
+        <w:tc>
+          <w:tcPr>
+            <w:tcW w:type="dxa" w:w="752"/>
+          </w:tcPr>
+          <w:p/>
+        </w:tc>
+        <w:tc>
+          <w:tcPr>
+            <w:tcW w:type="dxa" w:w="752"/>
+          </w:tcPr>
+          <w:p/>
+        </w:tc>
+        <w:tc>
+          <w:tcPr>
+            <w:tcW w:type="dxa" w:w="752"/>
+          </w:tcPr>
+          <w:p/>
+        </w:tc>
+      </w:tr>
+    </w:tbl>
     <w:p>
       <w:pPr>
-        <w:spacing w:after="120"/>
-      </w:pPr>
-      <w:r>
-        <w:rPr>
-          <w:b/>
-          <w:i w:val="0"/>
-          <w:color w:val="FFFFFF"/>
-          <w:sz w:val="16"/>
-          <w:shd w:val="clear" w:color="auto" w:fill="1F4E78"/>
-        </w:rPr>
-        <w:t xml:space="preserve">  1ST PRIZE CHAMPIONS  </w:t>
-      </w:r>
-    </w:p>
-    <w:p>
-      <w:pPr>
-        <w:spacing w:after="100" w:line="288" w:lineRule="auto"/>
-        <w:jc w:val="left"/>
-      </w:pPr>
-      <w:r>
-        <w:rPr>
-          <w:b/>
-          <w:i w:val="0"/>
-          <w:color w:val="1F4E78"/>
-          <w:sz w:val="34"/>
-        </w:rPr>
-        <w:t>Global Smart Cities Hackathon Championship 2026</w:t>
-      </w:r>
-    </w:p>
-    <w:p>
-      <w:pPr>
-        <w:spacing w:after="100"/>
-      </w:pPr>
-      <w:r>
-        <w:rPr>
-          <w:b/>
-          <w:i w:val="0"/>
-          <w:color w:val="475569"/>
-          <w:sz w:val="21"/>
-        </w:rPr>
-        <w:t>By Rohan Sharma, Anita Roy, Kevin Patel</w:t>
-      </w:r>
-    </w:p>
-    <w:p>
-      <w:pPr>
-        <w:spacing w:after="0"/>
-      </w:pPr>
-      <w:r>
-        <w:drawing>
-          <wp:inline xmlns:a="http://schemas.openxmlformats.org/drawingml/2006/main" xmlns:pic="http://schemas.openxmlformats.org/drawingml/2006/picture">
-            <wp:extent cx="5733288" cy="3220197"/>
-            <wp:docPr id="1" name="Picture 1"/>
-            <wp:cNvGraphicFramePr>
-              <a:graphicFrameLocks noChangeAspect="1"/>
-            </wp:cNvGraphicFramePr>
-            <a:graphic>
-              <a:graphicData uri="http://schemas.openxmlformats.org/drawingml/2006/picture">
-                <pic:pic>
-                  <pic:nvPicPr>
-                    <pic:cNvPr id="0" name="crop_bb29c594e935244408308af87708504d.jpg"/>
-                    <pic:cNvPicPr/>
-                  </pic:nvPicPr>
-                  <pic:blipFill>
-                    <a:blip r:embed="rId9"/>
-                    <a:stretch>
-                      <a:fillRect/>
-                    </a:stretch>
-                  </pic:blipFill>
-                  <pic:spPr>
-                    <a:xfrm>
-                      <a:off x="0" y="0"/>
-                      <a:ext cx="5733288" cy="3220197"/>
-                    </a:xfrm>
-                    <a:prstGeom prst="rect"/>
-                  </pic:spPr>
-                </pic:pic>
-              </a:graphicData>
-            </a:graphic>
-          </wp:inline>
-        </w:drawing>
-      </w:r>
-    </w:p>
-    <w:p>
-      <w:pPr>
-        <w:spacing w:after="160"/>
-        <w:shd w:val="clear" w:color="auto" w:fill="F8FAFC"/>
-      </w:pPr>
-      <w:r>
-        <w:rPr>
-          <w:b w:val="0"/>
-          <w:i/>
-          <w:color w:val="64748B"/>
-          <w:sz w:val="18"/>
-        </w:rPr>
-        <w:t xml:space="preserve"> Left to Right: Rohan Sharma, Anita Roy, Kevin Patel with 1st Prize trophy</w:t>
-      </w:r>
-    </w:p>
-    <w:p>
-      <w:pPr>
-        <w:spacing w:after="160" w:line="384" w:lineRule="auto"/>
-        <w:jc w:val="left"/>
-      </w:pPr>
-      <w:r>
-        <w:rPr>
-          <w:b w:val="0"/>
-          <w:i w:val="0"/>
-          <w:color w:val="334155"/>
-          <w:sz w:val="21"/>
-        </w:rPr>
-        <w:t>Built an autonomous drone dispatch platform for disaster relief operations.</w:t>
-      </w:r>
-    </w:p>
-    <w:p>
-      <w:pPr>
-        <w:spacing w:after="160"/>
-      </w:pPr>
-      <w:hyperlink r:id="rId10">
-        <w:r>
-          <w:rPr>
-            <w:b/>
-            <w:color w:val="FFFFFF"/>
-            <w:sz w:val="19"/>
-            <w:shd w:val="clear" w:color="auto" w:fill="1F4E78"/>
-          </w:rPr>
-          <w:t xml:space="preserve">   View details   </w:t>
-        </w:r>
-      </w:hyperlink>
-    </w:p>
-    <w:p>
-      <w:pPr>
-        <w:spacing w:before="200" w:after="200"/>
         <w:pBdr>
           <w:bottom w:val="single" w:sz="6" w:space="1" w:color="D9DEE4"/>
         </w:pBdr>
+        <w:spacing w:before="200" w:after="200"/>
       </w:pPr>
     </w:p>
+    <w:tbl>
+      <w:tblPr>
+        <w:tblW w:type="auto" w:w="0"/>
+        <w:jc w:val="left"/>
+        <w:tblLayout w:type="fixed"/>
+        <w:tblLook w:firstColumn="1" w:firstRow="1" w:lastColumn="0" w:lastRow="0" w:noHBand="0" w:noVBand="1" w:val="04A0"/>
+      </w:tblPr>
+      <w:tblGrid>
+        <w:gridCol w:w="752"/>
+        <w:gridCol w:w="752"/>
+        <w:gridCol w:w="752"/>
+        <w:gridCol w:w="752"/>
+        <w:gridCol w:w="752"/>
+        <w:gridCol w:w="752"/>
+        <w:gridCol w:w="752"/>
+        <w:gridCol w:w="752"/>
+        <w:gridCol w:w="752"/>
+        <w:gridCol w:w="752"/>
+        <w:gridCol w:w="752"/>
+        <w:gridCol w:w="752"/>
+      </w:tblGrid>
+      <w:tr>
+        <w:trPr>
+          <w:trHeight w:val="420" w:hRule="atLeast"/>
+        </w:trPr>
+        <w:tc>
+          <w:tcPr>
+            <w:tcW w:type="dxa" w:w="9024"/>
+            <w:gridSpan w:val="12"/>
+            <w:tcMar>
+              <w:top w:w="20" w:type="dxa"/>
+              <w:left w:w="60" w:type="dxa"/>
+              <w:bottom w:w="20" w:type="dxa"/>
+              <w:right w:w="60" w:type="dxa"/>
+            </w:tcMar>
+            <w:vAlign w:val="top"/>
+          </w:tcPr>
+          <w:p>
+            <w:pPr>
+              <w:spacing w:after="0"/>
+              <w:jc w:val="left"/>
+            </w:pPr>
+            <w:r>
+              <w:rPr>
+                <w:b/>
+                <w:i w:val="0"/>
+                <w:color w:val="FFFFFF"/>
+                <w:sz w:val="16"/>
+                <w:shd w:val="clear" w:color="auto" w:fill="1F4E78"/>
+              </w:rPr>
+              <w:t xml:space="preserve">  1ST PRIZE ($5,000)  </w:t>
+            </w:r>
+          </w:p>
+        </w:tc>
+      </w:tr>
+      <w:tr>
+        <w:trPr>
+          <w:trHeight w:val="420" w:hRule="atLeast"/>
+        </w:trPr>
+        <w:tc>
+          <w:tcPr>
+            <w:tcW w:type="dxa" w:w="9024"/>
+            <w:gridSpan w:val="12"/>
+            <w:vMerge w:val="restart"/>
+            <w:tcMar>
+              <w:top w:w="20" w:type="dxa"/>
+              <w:left w:w="60" w:type="dxa"/>
+              <w:bottom w:w="20" w:type="dxa"/>
+              <w:right w:w="60" w:type="dxa"/>
+            </w:tcMar>
+            <w:vAlign w:val="top"/>
+          </w:tcPr>
+          <w:p>
+            <w:pPr>
+              <w:spacing w:line="288" w:lineRule="auto" w:after="0"/>
+              <w:jc w:val="left"/>
+            </w:pPr>
+            <w:r>
+              <w:rPr>
+                <w:b/>
+                <w:i w:val="0"/>
+                <w:color w:val="1F4E78"/>
+                <w:sz w:val="34"/>
+              </w:rPr>
+              <w:t>Global Smart Cities Hackathon Championship 2026</w:t>
+            </w:r>
+          </w:p>
+        </w:tc>
+      </w:tr>
+      <w:tr>
+        <w:trPr>
+          <w:trHeight w:val="420" w:hRule="atLeast"/>
+        </w:trPr>
+        <w:tc>
+          <w:tcPr>
+            <w:tcW w:type="dxa" w:w="9024"/>
+            <w:gridSpan w:val="12"/>
+            <w:vMerge/>
+          </w:tcPr>
+          <w:p/>
+        </w:tc>
+      </w:tr>
+      <w:tr>
+        <w:trPr>
+          <w:trHeight w:val="420" w:hRule="atLeast"/>
+        </w:trPr>
+        <w:tc>
+          <w:tcPr>
+            <w:tcW w:type="dxa" w:w="9024"/>
+            <w:gridSpan w:val="12"/>
+            <w:vMerge/>
+          </w:tcPr>
+          <w:p/>
+        </w:tc>
+      </w:tr>
+      <w:tr>
+        <w:trPr>
+          <w:trHeight w:val="420" w:hRule="atLeast"/>
+        </w:trPr>
+        <w:tc>
+          <w:tcPr>
+            <w:tcW w:type="dxa" w:w="9024"/>
+            <w:gridSpan w:val="12"/>
+            <w:tcMar>
+              <w:top w:w="20" w:type="dxa"/>
+              <w:left w:w="60" w:type="dxa"/>
+              <w:bottom w:w="20" w:type="dxa"/>
+              <w:right w:w="60" w:type="dxa"/>
+            </w:tcMar>
+            <w:vAlign w:val="top"/>
+          </w:tcPr>
+          <w:p>
+            <w:pPr>
+              <w:spacing w:after="0"/>
+              <w:jc w:val="left"/>
+            </w:pPr>
+            <w:r>
+              <w:rPr>
+                <w:b/>
+                <w:i w:val="0"/>
+                <w:color w:val="475569"/>
+                <w:sz w:val="21"/>
+              </w:rPr>
+              <w:t>By Rohan Sharma, Anita Roy, Kevin Patel (Dept of IT)</w:t>
+            </w:r>
+          </w:p>
+        </w:tc>
+      </w:tr>
+      <w:tr>
+        <w:trPr>
+          <w:trHeight w:val="420" w:hRule="atLeast"/>
+        </w:trPr>
+        <w:tc>
+          <w:tcPr>
+            <w:tcW w:type="dxa" w:w="9024"/>
+            <w:gridSpan w:val="12"/>
+            <w:vMerge w:val="restart"/>
+            <w:tcMar>
+              <w:top w:w="20" w:type="dxa"/>
+              <w:left w:w="60" w:type="dxa"/>
+              <w:bottom w:w="20" w:type="dxa"/>
+              <w:right w:w="60" w:type="dxa"/>
+            </w:tcMar>
+            <w:vAlign w:val="top"/>
+          </w:tcPr>
+          <w:p>
+            <w:pPr>
+              <w:spacing w:after="0"/>
+              <w:jc w:val="left"/>
+            </w:pPr>
+            <w:r>
+              <w:drawing>
+                <wp:inline xmlns:a="http://schemas.openxmlformats.org/drawingml/2006/main" xmlns:pic="http://schemas.openxmlformats.org/drawingml/2006/picture">
+                  <wp:extent cx="5660136" cy="2971571"/>
+                  <wp:docPr id="2" name="Picture 2"/>
+                  <wp:cNvGraphicFramePr>
+                    <a:graphicFrameLocks noChangeAspect="1"/>
+                  </wp:cNvGraphicFramePr>
+                  <a:graphic>
+                    <a:graphicData uri="http://schemas.openxmlformats.org/drawingml/2006/picture">
+                      <pic:pic>
+                        <pic:nvPicPr>
+                          <pic:cNvPr id="0" name="crop_9c3c71f6317d4368a30494a075c0c3fa.jpg"/>
+                          <pic:cNvPicPr/>
+                        </pic:nvPicPr>
+                        <pic:blipFill>
+                          <a:blip r:embed="rId9"/>
+                          <a:stretch>
+                            <a:fillRect/>
+                          </a:stretch>
+                        </pic:blipFill>
+                        <pic:spPr>
+                          <a:xfrm>
+                            <a:off x="0" y="0"/>
+                            <a:ext cx="5660136" cy="2971571"/>
+                          </a:xfrm>
+                          <a:prstGeom prst="rect"/>
+                        </pic:spPr>
+                      </pic:pic>
+                    </a:graphicData>
+                  </a:graphic>
+                </wp:inline>
+              </w:drawing>
+            </w:r>
+          </w:p>
+          <w:p>
+            <w:pPr>
+              <w:shd w:val="clear" w:color="auto" w:fill="F8FAFC"/>
+              <w:spacing w:after="0"/>
+            </w:pPr>
+            <w:r>
+              <w:rPr>
+                <w:b w:val="0"/>
+                <w:i/>
+                <w:color w:val="64748B"/>
+                <w:sz w:val="18"/>
+              </w:rPr>
+              <w:t xml:space="preserve"> Left to Right: Rohan Sharma, Anita Roy, Kevin Patel holding the 1st Place Hackathon Trophy</w:t>
+            </w:r>
+          </w:p>
+        </w:tc>
+      </w:tr>
+      <w:tr>
+        <w:trPr>
+          <w:trHeight w:val="420" w:hRule="atLeast"/>
+        </w:trPr>
+        <w:tc>
+          <w:tcPr>
+            <w:tcW w:type="dxa" w:w="9024"/>
+            <w:gridSpan w:val="12"/>
+            <w:vMerge/>
+          </w:tcPr>
+          <w:p/>
+        </w:tc>
+      </w:tr>
+      <w:tr>
+        <w:trPr>
+          <w:trHeight w:val="420" w:hRule="atLeast"/>
+        </w:trPr>
+        <w:tc>
+          <w:tcPr>
+            <w:tcW w:type="dxa" w:w="9024"/>
+            <w:gridSpan w:val="12"/>
+            <w:vMerge/>
+          </w:tcPr>
+          <w:p/>
+        </w:tc>
+      </w:tr>
+      <w:tr>
+        <w:trPr>
+          <w:trHeight w:val="420" w:hRule="atLeast"/>
+        </w:trPr>
+        <w:tc>
+          <w:tcPr>
+            <w:tcW w:type="dxa" w:w="9024"/>
+            <w:gridSpan w:val="12"/>
+            <w:vMerge/>
+          </w:tcPr>
+          <w:p/>
+        </w:tc>
+      </w:tr>
+      <w:tr>
+        <w:trPr>
+          <w:trHeight w:val="420" w:hRule="atLeast"/>
+        </w:trPr>
+        <w:tc>
+          <w:tcPr>
+            <w:tcW w:type="dxa" w:w="9024"/>
+            <w:gridSpan w:val="12"/>
+            <w:vMerge/>
+          </w:tcPr>
+          <w:p/>
+        </w:tc>
+      </w:tr>
+      <w:tr>
+        <w:trPr>
+          <w:trHeight w:val="420" w:hRule="atLeast"/>
+        </w:trPr>
+        <w:tc>
+          <w:tcPr>
+            <w:tcW w:type="dxa" w:w="9024"/>
+            <w:gridSpan w:val="12"/>
+            <w:vMerge/>
+          </w:tcPr>
+          <w:p/>
+        </w:tc>
+      </w:tr>
+      <w:tr>
+        <w:trPr>
+          <w:trHeight w:val="420" w:hRule="atLeast"/>
+        </w:trPr>
+        <w:tc>
+          <w:tcPr>
+            <w:tcW w:type="dxa" w:w="9024"/>
+            <w:gridSpan w:val="12"/>
+            <w:vMerge/>
+          </w:tcPr>
+          <w:p/>
+        </w:tc>
+      </w:tr>
+      <w:tr>
+        <w:trPr>
+          <w:trHeight w:val="420" w:hRule="atLeast"/>
+        </w:trPr>
+        <w:tc>
+          <w:tcPr>
+            <w:tcW w:type="dxa" w:w="9024"/>
+            <w:gridSpan w:val="12"/>
+            <w:vMerge/>
+          </w:tcPr>
+          <w:p/>
+        </w:tc>
+      </w:tr>
+      <w:tr>
+        <w:trPr>
+          <w:trHeight w:val="420" w:hRule="atLeast"/>
+        </w:trPr>
+        <w:tc>
+          <w:tcPr>
+            <w:tcW w:type="dxa" w:w="9024"/>
+            <w:gridSpan w:val="12"/>
+            <w:vMerge/>
+          </w:tcPr>
+          <w:p/>
+        </w:tc>
+      </w:tr>
+      <w:tr>
+        <w:trPr>
+          <w:trHeight w:val="420" w:hRule="atLeast"/>
+        </w:trPr>
+        <w:tc>
+          <w:tcPr>
+            <w:tcW w:type="dxa" w:w="9024"/>
+            <w:gridSpan w:val="12"/>
+            <w:vMerge/>
+          </w:tcPr>
+          <w:p/>
+        </w:tc>
+      </w:tr>
+      <w:tr>
+        <w:trPr>
+          <w:trHeight w:val="420" w:hRule="atLeast"/>
+        </w:trPr>
+        <w:tc>
+          <w:tcPr>
+            <w:tcW w:type="dxa" w:w="9024"/>
+            <w:gridSpan w:val="12"/>
+            <w:vMerge/>
+          </w:tcPr>
+          <w:p/>
+        </w:tc>
+      </w:tr>
+      <w:tr>
+        <w:trPr>
+          <w:trHeight w:val="420" w:hRule="atLeast"/>
+        </w:trPr>
+        <w:tc>
+          <w:tcPr>
+            <w:tcW w:type="dxa" w:w="9024"/>
+            <w:gridSpan w:val="12"/>
+            <w:vMerge/>
+          </w:tcPr>
+          <w:p/>
+        </w:tc>
+      </w:tr>
+      <w:tr>
+        <w:trPr>
+          <w:trHeight w:val="420" w:hRule="atLeast"/>
+        </w:trPr>
+        <w:tc>
+          <w:tcPr>
+            <w:tcW w:type="dxa" w:w="9024"/>
+            <w:gridSpan w:val="12"/>
+            <w:vMerge w:val="restart"/>
+            <w:tcMar>
+              <w:top w:w="20" w:type="dxa"/>
+              <w:left w:w="60" w:type="dxa"/>
+              <w:bottom w:w="20" w:type="dxa"/>
+              <w:right w:w="60" w:type="dxa"/>
+            </w:tcMar>
+            <w:vAlign w:val="top"/>
+          </w:tcPr>
+          <w:p>
+            <w:pPr>
+              <w:spacing w:line="360" w:lineRule="auto" w:after="0"/>
+              <w:jc w:val="left"/>
+            </w:pPr>
+            <w:r>
+              <w:rPr>
+                <w:b w:val="0"/>
+                <w:i w:val="0"/>
+                <w:color w:val="334155"/>
+                <w:sz w:val="21"/>
+              </w:rPr>
+              <w:t>Secured 1st rank among 350+ international university teams by developing an autonomous AI disaster dispatch drone management system capable of optimizing medical kit deliveries during flood relief operations.</w:t>
+            </w:r>
+          </w:p>
+        </w:tc>
+      </w:tr>
+      <w:tr>
+        <w:trPr>
+          <w:trHeight w:val="420" w:hRule="atLeast"/>
+        </w:trPr>
+        <w:tc>
+          <w:tcPr>
+            <w:tcW w:type="dxa" w:w="9024"/>
+            <w:gridSpan w:val="12"/>
+            <w:vMerge/>
+          </w:tcPr>
+          <w:p/>
+        </w:tc>
+      </w:tr>
+      <w:tr>
+        <w:trPr>
+          <w:trHeight w:val="420" w:hRule="atLeast"/>
+        </w:trPr>
+        <w:tc>
+          <w:tcPr>
+            <w:tcW w:type="dxa" w:w="9024"/>
+            <w:gridSpan w:val="12"/>
+            <w:vMerge/>
+          </w:tcPr>
+          <w:p/>
+        </w:tc>
+      </w:tr>
+      <w:tr>
+        <w:trPr>
+          <w:trHeight w:val="420" w:hRule="atLeast"/>
+        </w:trPr>
+        <w:tc>
+          <w:tcPr>
+            <w:tcW w:type="dxa" w:w="9024"/>
+            <w:gridSpan w:val="12"/>
+            <w:vMerge/>
+          </w:tcPr>
+          <w:p/>
+        </w:tc>
+      </w:tr>
+      <w:tr>
+        <w:trPr>
+          <w:trHeight w:val="420" w:hRule="atLeast"/>
+        </w:trPr>
+        <w:tc>
+          <w:tcPr>
+            <w:tcW w:type="dxa" w:w="9024"/>
+            <w:gridSpan w:val="12"/>
+            <w:vMerge/>
+          </w:tcPr>
+          <w:p/>
+        </w:tc>
+      </w:tr>
+      <w:tr>
+        <w:trPr>
+          <w:trHeight w:val="420" w:hRule="atLeast"/>
+        </w:trPr>
+        <w:tc>
+          <w:tcPr>
+            <w:tcW w:type="dxa" w:w="9024"/>
+            <w:gridSpan w:val="12"/>
+            <w:vMerge/>
+          </w:tcPr>
+          <w:p/>
+        </w:tc>
+      </w:tr>
+      <w:tr>
+        <w:trPr>
+          <w:trHeight w:val="420" w:hRule="atLeast"/>
+        </w:trPr>
+        <w:tc>
+          <w:tcPr>
+            <w:tcW w:type="dxa" w:w="4512"/>
+            <w:gridSpan w:val="6"/>
+            <w:vMerge w:val="restart"/>
+            <w:tcMar>
+              <w:top w:w="20" w:type="dxa"/>
+              <w:left w:w="60" w:type="dxa"/>
+              <w:bottom w:w="20" w:type="dxa"/>
+              <w:right w:w="60" w:type="dxa"/>
+            </w:tcMar>
+            <w:vAlign w:val="top"/>
+          </w:tcPr>
+          <w:p>
+            <w:pPr>
+              <w:spacing w:after="0"/>
+              <w:jc w:val="left"/>
+            </w:pPr>
+            <w:hyperlink r:id="rId11">
+              <w:r>
+                <w:rPr>
+                  <w:b/>
+                  <w:color w:val="FFFFFF"/>
+                  <w:sz w:val="19"/>
+                  <w:shd w:val="clear" w:color="auto" w:fill="1F4E78"/>
+                </w:rPr>
+                <w:t xml:space="preserve">   View details   </w:t>
+              </w:r>
+            </w:hyperlink>
+          </w:p>
+        </w:tc>
+        <w:tc>
+          <w:tcPr>
+            <w:tcW w:type="dxa" w:w="752"/>
+          </w:tcPr>
+          <w:p/>
+        </w:tc>
+        <w:tc>
+          <w:tcPr>
+            <w:tcW w:type="dxa" w:w="752"/>
+          </w:tcPr>
+          <w:p/>
+        </w:tc>
+        <w:tc>
+          <w:tcPr>
+            <w:tcW w:type="dxa" w:w="752"/>
+          </w:tcPr>
+          <w:p/>
+        </w:tc>
+        <w:tc>
+          <w:tcPr>
+            <w:tcW w:type="dxa" w:w="752"/>
+          </w:tcPr>
+          <w:p/>
+        </w:tc>
+        <w:tc>
+          <w:tcPr>
+            <w:tcW w:type="dxa" w:w="752"/>
+          </w:tcPr>
+          <w:p/>
+        </w:tc>
+        <w:tc>
+          <w:tcPr>
+            <w:tcW w:type="dxa" w:w="752"/>
+          </w:tcPr>
+          <w:p/>
+        </w:tc>
+      </w:tr>
+      <w:tr>
+        <w:trPr>
+          <w:trHeight w:val="420" w:hRule="atLeast"/>
+        </w:trPr>
+        <w:tc>
+          <w:tcPr>
+            <w:tcW w:type="dxa" w:w="4512"/>
+            <w:gridSpan w:val="6"/>
+            <w:vMerge/>
+          </w:tcPr>
+          <w:p/>
+        </w:tc>
+        <w:tc>
+          <w:tcPr>
+            <w:tcW w:type="dxa" w:w="752"/>
+          </w:tcPr>
+          <w:p/>
+        </w:tc>
+        <w:tc>
+          <w:tcPr>
+            <w:tcW w:type="dxa" w:w="752"/>
+          </w:tcPr>
+          <w:p/>
+        </w:tc>
+        <w:tc>
+          <w:tcPr>
+            <w:tcW w:type="dxa" w:w="752"/>
+          </w:tcPr>
+          <w:p/>
+        </w:tc>
+        <w:tc>
+          <w:tcPr>
+            <w:tcW w:type="dxa" w:w="752"/>
+          </w:tcPr>
+          <w:p/>
+        </w:tc>
+        <w:tc>
+          <w:tcPr>
+            <w:tcW w:type="dxa" w:w="752"/>
+          </w:tcPr>
+          <w:p/>
+        </w:tc>
+        <w:tc>
+          <w:tcPr>
+            <w:tcW w:type="dxa" w:w="752"/>
+          </w:tcPr>
+          <w:p/>
+        </w:tc>
+      </w:tr>
+    </w:tbl>
     <w:p>
       <w:pPr>
-        <w:spacing w:after="120"/>
-      </w:pPr>
-      <w:r>
-        <w:rPr>
-          <w:b/>
-          <w:i w:val="0"/>
-          <w:color w:val="FFFFFF"/>
-          <w:sz w:val="16"/>
-          <w:shd w:val="clear" w:color="auto" w:fill="1F4E78"/>
-        </w:rPr>
-        <w:t xml:space="preserve">  1ST PRIZE ($5,000)  </w:t>
-      </w:r>
-    </w:p>
-    <w:p>
-      <w:pPr>
-        <w:spacing w:after="100" w:line="288" w:lineRule="auto"/>
-        <w:jc w:val="left"/>
-      </w:pPr>
-      <w:r>
-        <w:rPr>
-          <w:b/>
-          <w:i w:val="0"/>
-          <w:color w:val="1F4E78"/>
-          <w:sz w:val="34"/>
-        </w:rPr>
-        <w:t>Global Smart Cities Hackathon Championship 2026</w:t>
-      </w:r>
-    </w:p>
-    <w:p>
-      <w:pPr>
-        <w:spacing w:after="100"/>
-      </w:pPr>
-      <w:r>
-        <w:rPr>
-          <w:b/>
-          <w:i w:val="0"/>
-          <w:color w:val="475569"/>
-          <w:sz w:val="21"/>
-        </w:rPr>
-        <w:t>By Rohan Sharma, Anita Roy, Kevin Patel (Dept of IT)</w:t>
-      </w:r>
-    </w:p>
-    <w:p>
-      <w:pPr>
-        <w:spacing w:after="0"/>
-      </w:pPr>
-      <w:r>
-        <w:drawing>
-          <wp:inline xmlns:a="http://schemas.openxmlformats.org/drawingml/2006/main" xmlns:pic="http://schemas.openxmlformats.org/drawingml/2006/picture">
-            <wp:extent cx="5733288" cy="3220197"/>
-            <wp:docPr id="2" name="Picture 2"/>
-            <wp:cNvGraphicFramePr>
-              <a:graphicFrameLocks noChangeAspect="1"/>
-            </wp:cNvGraphicFramePr>
-            <a:graphic>
-              <a:graphicData uri="http://schemas.openxmlformats.org/drawingml/2006/picture">
-                <pic:pic>
-                  <pic:nvPicPr>
-                    <pic:cNvPr id="0" name="crop_bb29c594e935244408308af87708504d.jpg"/>
-                    <pic:cNvPicPr/>
-                  </pic:nvPicPr>
-                  <pic:blipFill>
-                    <a:blip r:embed="rId9"/>
-                    <a:stretch>
-                      <a:fillRect/>
-                    </a:stretch>
-                  </pic:blipFill>
-                  <pic:spPr>
-                    <a:xfrm>
-                      <a:off x="0" y="0"/>
-                      <a:ext cx="5733288" cy="3220197"/>
-                    </a:xfrm>
-                    <a:prstGeom prst="rect"/>
-                  </pic:spPr>
-                </pic:pic>
-              </a:graphicData>
-            </a:graphic>
-          </wp:inline>
-        </w:drawing>
-      </w:r>
-    </w:p>
-    <w:p>
-      <w:pPr>
-        <w:spacing w:after="160"/>
-        <w:shd w:val="clear" w:color="auto" w:fill="F8FAFC"/>
-      </w:pPr>
-      <w:r>
-        <w:rPr>
-          <w:b w:val="0"/>
-          <w:i/>
-          <w:color w:val="64748B"/>
-          <w:sz w:val="18"/>
-        </w:rPr>
-        <w:t xml:space="preserve"> Left to Right: Rohan Sharma, Anita Roy, Kevin Patel holding the 1st Place Hackathon Trophy</w:t>
-      </w:r>
-    </w:p>
-    <w:p>
-      <w:pPr>
-        <w:spacing w:after="160" w:line="384" w:lineRule="auto"/>
-        <w:jc w:val="left"/>
-      </w:pPr>
-      <w:r>
-        <w:rPr>
-          <w:b w:val="0"/>
-          <w:i w:val="0"/>
-          <w:color w:val="334155"/>
-          <w:sz w:val="21"/>
-        </w:rPr>
-        <w:t>Secured 1st rank among 350+ international university teams by developing an autonomous AI disaster dispatch drone management system capable of optimizing medical kit deliveries during flood relief operations.</w:t>
-      </w:r>
-    </w:p>
-    <w:p>
-      <w:pPr>
-        <w:spacing w:after="160"/>
-      </w:pPr>
-      <w:hyperlink r:id="rId11">
-        <w:r>
-          <w:rPr>
-            <w:b/>
-            <w:color w:val="FFFFFF"/>
-            <w:sz w:val="19"/>
-            <w:shd w:val="clear" w:color="auto" w:fill="1F4E78"/>
-          </w:rPr>
-          <w:t xml:space="preserve">   View details   </w:t>
-        </w:r>
-      </w:hyperlink>
-    </w:p>
-    <w:p>
-      <w:pPr>
-        <w:spacing w:before="200" w:after="200"/>
         <w:pBdr>
           <w:bottom w:val="single" w:sz="6" w:space="1" w:color="D9DEE4"/>
         </w:pBdr>
+        <w:spacing w:before="200" w:after="200"/>
       </w:pPr>
     </w:p>
+    <w:tbl>
+      <w:tblPr>
+        <w:tblW w:type="auto" w:w="0"/>
+        <w:jc w:val="left"/>
+        <w:tblLayout w:type="fixed"/>
+        <w:tblLook w:firstColumn="1" w:firstRow="1" w:lastColumn="0" w:lastRow="0" w:noHBand="0" w:noVBand="1" w:val="04A0"/>
+      </w:tblPr>
+      <w:tblGrid>
+        <w:gridCol w:w="752"/>
+        <w:gridCol w:w="752"/>
+        <w:gridCol w:w="752"/>
+        <w:gridCol w:w="752"/>
+        <w:gridCol w:w="752"/>
+        <w:gridCol w:w="752"/>
+        <w:gridCol w:w="752"/>
+        <w:gridCol w:w="752"/>
+        <w:gridCol w:w="752"/>
+        <w:gridCol w:w="752"/>
+        <w:gridCol w:w="752"/>
+        <w:gridCol w:w="752"/>
+      </w:tblGrid>
+      <w:tr>
+        <w:trPr>
+          <w:trHeight w:val="420" w:hRule="atLeast"/>
+        </w:trPr>
+        <w:tc>
+          <w:tcPr>
+            <w:tcW w:type="dxa" w:w="9024"/>
+            <w:gridSpan w:val="12"/>
+            <w:vMerge w:val="restart"/>
+            <w:tcMar>
+              <w:top w:w="20" w:type="dxa"/>
+              <w:left w:w="60" w:type="dxa"/>
+              <w:bottom w:w="20" w:type="dxa"/>
+              <w:right w:w="60" w:type="dxa"/>
+            </w:tcMar>
+            <w:vAlign w:val="top"/>
+          </w:tcPr>
+          <w:p>
+            <w:pPr>
+              <w:spacing w:line="288" w:lineRule="auto" w:after="0"/>
+              <w:jc w:val="left"/>
+            </w:pPr>
+            <w:r>
+              <w:rPr>
+                <w:b/>
+                <w:i w:val="0"/>
+                <w:color w:val="1F4E78"/>
+                <w:sz w:val="34"/>
+              </w:rPr>
+              <w:t>Global Hackathon Championship 2026</w:t>
+            </w:r>
+          </w:p>
+        </w:tc>
+      </w:tr>
+      <w:tr>
+        <w:trPr>
+          <w:trHeight w:val="420" w:hRule="atLeast"/>
+        </w:trPr>
+        <w:tc>
+          <w:tcPr>
+            <w:tcW w:type="dxa" w:w="9024"/>
+            <w:gridSpan w:val="12"/>
+            <w:vMerge/>
+          </w:tcPr>
+          <w:p/>
+        </w:tc>
+      </w:tr>
+      <w:tr>
+        <w:trPr>
+          <w:trHeight w:val="420" w:hRule="atLeast"/>
+        </w:trPr>
+        <w:tc>
+          <w:tcPr>
+            <w:tcW w:type="dxa" w:w="9024"/>
+            <w:gridSpan w:val="12"/>
+            <w:vMerge/>
+          </w:tcPr>
+          <w:p/>
+        </w:tc>
+      </w:tr>
+      <w:tr>
+        <w:trPr>
+          <w:trHeight w:val="420" w:hRule="atLeast"/>
+        </w:trPr>
+        <w:tc>
+          <w:tcPr>
+            <w:tcW w:type="dxa" w:w="9024"/>
+            <w:gridSpan w:val="12"/>
+            <w:tcMar>
+              <w:top w:w="20" w:type="dxa"/>
+              <w:left w:w="60" w:type="dxa"/>
+              <w:bottom w:w="20" w:type="dxa"/>
+              <w:right w:w="60" w:type="dxa"/>
+            </w:tcMar>
+            <w:vAlign w:val="top"/>
+          </w:tcPr>
+          <w:p>
+            <w:pPr>
+              <w:spacing w:after="0"/>
+              <w:jc w:val="left"/>
+            </w:pPr>
+            <w:r>
+              <w:rPr>
+                <w:b/>
+                <w:i w:val="0"/>
+                <w:color w:val="475569"/>
+                <w:sz w:val="21"/>
+              </w:rPr>
+              <w:t>By Rohan Sharma, Anita Roy, Kevin Patel</w:t>
+            </w:r>
+          </w:p>
+        </w:tc>
+      </w:tr>
+      <w:tr>
+        <w:trPr>
+          <w:trHeight w:val="420" w:hRule="atLeast"/>
+        </w:trPr>
+        <w:tc>
+          <w:tcPr>
+            <w:tcW w:type="dxa" w:w="9024"/>
+            <w:gridSpan w:val="12"/>
+            <w:vMerge w:val="restart"/>
+            <w:tcMar>
+              <w:top w:w="20" w:type="dxa"/>
+              <w:left w:w="60" w:type="dxa"/>
+              <w:bottom w:w="20" w:type="dxa"/>
+              <w:right w:w="60" w:type="dxa"/>
+            </w:tcMar>
+            <w:vAlign w:val="top"/>
+          </w:tcPr>
+          <w:p>
+            <w:pPr>
+              <w:spacing w:after="0"/>
+            </w:pPr>
+          </w:p>
+        </w:tc>
+      </w:tr>
+      <w:tr>
+        <w:trPr>
+          <w:trHeight w:val="420" w:hRule="atLeast"/>
+        </w:trPr>
+        <w:tc>
+          <w:tcPr>
+            <w:tcW w:type="dxa" w:w="9024"/>
+            <w:gridSpan w:val="12"/>
+            <w:vMerge/>
+          </w:tcPr>
+          <w:p/>
+        </w:tc>
+      </w:tr>
+      <w:tr>
+        <w:trPr>
+          <w:trHeight w:val="420" w:hRule="atLeast"/>
+        </w:trPr>
+        <w:tc>
+          <w:tcPr>
+            <w:tcW w:type="dxa" w:w="9024"/>
+            <w:gridSpan w:val="12"/>
+            <w:vMerge/>
+          </w:tcPr>
+          <w:p/>
+        </w:tc>
+      </w:tr>
+      <w:tr>
+        <w:trPr>
+          <w:trHeight w:val="420" w:hRule="atLeast"/>
+        </w:trPr>
+        <w:tc>
+          <w:tcPr>
+            <w:tcW w:type="dxa" w:w="9024"/>
+            <w:gridSpan w:val="12"/>
+            <w:vMerge/>
+          </w:tcPr>
+          <w:p/>
+        </w:tc>
+      </w:tr>
+      <w:tr>
+        <w:trPr>
+          <w:trHeight w:val="420" w:hRule="atLeast"/>
+        </w:trPr>
+        <w:tc>
+          <w:tcPr>
+            <w:tcW w:type="dxa" w:w="9024"/>
+            <w:gridSpan w:val="12"/>
+            <w:vMerge/>
+          </w:tcPr>
+          <w:p/>
+        </w:tc>
+      </w:tr>
+      <w:tr>
+        <w:trPr>
+          <w:trHeight w:val="420" w:hRule="atLeast"/>
+        </w:trPr>
+        <w:tc>
+          <w:tcPr>
+            <w:tcW w:type="dxa" w:w="9024"/>
+            <w:gridSpan w:val="12"/>
+            <w:vMerge/>
+          </w:tcPr>
+          <w:p/>
+        </w:tc>
+      </w:tr>
+      <w:tr>
+        <w:trPr>
+          <w:trHeight w:val="420" w:hRule="atLeast"/>
+        </w:trPr>
+        <w:tc>
+          <w:tcPr>
+            <w:tcW w:type="dxa" w:w="9024"/>
+            <w:gridSpan w:val="12"/>
+            <w:vMerge/>
+          </w:tcPr>
+          <w:p/>
+        </w:tc>
+      </w:tr>
+      <w:tr>
+        <w:trPr>
+          <w:trHeight w:val="420" w:hRule="atLeast"/>
+        </w:trPr>
+        <w:tc>
+          <w:tcPr>
+            <w:tcW w:type="dxa" w:w="9024"/>
+            <w:gridSpan w:val="12"/>
+            <w:vMerge/>
+          </w:tcPr>
+          <w:p/>
+        </w:tc>
+      </w:tr>
+      <w:tr>
+        <w:trPr>
+          <w:trHeight w:val="420" w:hRule="atLeast"/>
+        </w:trPr>
+        <w:tc>
+          <w:tcPr>
+            <w:tcW w:type="dxa" w:w="9024"/>
+            <w:gridSpan w:val="12"/>
+            <w:vMerge/>
+          </w:tcPr>
+          <w:p/>
+        </w:tc>
+      </w:tr>
+      <w:tr>
+        <w:trPr>
+          <w:trHeight w:val="420" w:hRule="atLeast"/>
+        </w:trPr>
+        <w:tc>
+          <w:tcPr>
+            <w:tcW w:type="dxa" w:w="9024"/>
+            <w:gridSpan w:val="12"/>
+            <w:vMerge/>
+          </w:tcPr>
+          <w:p/>
+        </w:tc>
+      </w:tr>
+      <w:tr>
+        <w:trPr>
+          <w:trHeight w:val="420" w:hRule="atLeast"/>
+        </w:trPr>
+        <w:tc>
+          <w:tcPr>
+            <w:tcW w:type="dxa" w:w="9024"/>
+            <w:gridSpan w:val="12"/>
+            <w:vMerge/>
+          </w:tcPr>
+          <w:p/>
+        </w:tc>
+      </w:tr>
+      <w:tr>
+        <w:trPr>
+          <w:trHeight w:val="420" w:hRule="atLeast"/>
+        </w:trPr>
+        <w:tc>
+          <w:tcPr>
+            <w:tcW w:type="dxa" w:w="9024"/>
+            <w:gridSpan w:val="12"/>
+            <w:vMerge/>
+          </w:tcPr>
+          <w:p/>
+        </w:tc>
+      </w:tr>
+      <w:tr>
+        <w:trPr>
+          <w:trHeight w:val="420" w:hRule="atLeast"/>
+        </w:trPr>
+        <w:tc>
+          <w:tcPr>
+            <w:tcW w:type="dxa" w:w="9024"/>
+            <w:gridSpan w:val="12"/>
+            <w:vMerge w:val="restart"/>
+            <w:tcMar>
+              <w:top w:w="20" w:type="dxa"/>
+              <w:left w:w="60" w:type="dxa"/>
+              <w:bottom w:w="20" w:type="dxa"/>
+              <w:right w:w="60" w:type="dxa"/>
+            </w:tcMar>
+            <w:vAlign w:val="top"/>
+          </w:tcPr>
+          <w:p>
+            <w:pPr>
+              <w:spacing w:line="360" w:lineRule="auto" w:after="0"/>
+              <w:jc w:val="left"/>
+            </w:pPr>
+            <w:r>
+              <w:rPr>
+                <w:b w:val="0"/>
+                <w:i w:val="0"/>
+                <w:color w:val="334155"/>
+                <w:sz w:val="21"/>
+              </w:rPr>
+              <w:t>Secured 1st rank out of 350 international teams for constructing an autonomous AI disaster response drone dispatch dashboard.</w:t>
+            </w:r>
+          </w:p>
+        </w:tc>
+      </w:tr>
+      <w:tr>
+        <w:trPr>
+          <w:trHeight w:val="420" w:hRule="atLeast"/>
+        </w:trPr>
+        <w:tc>
+          <w:tcPr>
+            <w:tcW w:type="dxa" w:w="9024"/>
+            <w:gridSpan w:val="12"/>
+            <w:vMerge/>
+          </w:tcPr>
+          <w:p/>
+        </w:tc>
+      </w:tr>
+      <w:tr>
+        <w:trPr>
+          <w:trHeight w:val="420" w:hRule="atLeast"/>
+        </w:trPr>
+        <w:tc>
+          <w:tcPr>
+            <w:tcW w:type="dxa" w:w="9024"/>
+            <w:gridSpan w:val="12"/>
+            <w:vMerge/>
+          </w:tcPr>
+          <w:p/>
+        </w:tc>
+      </w:tr>
+      <w:tr>
+        <w:trPr>
+          <w:trHeight w:val="420" w:hRule="atLeast"/>
+        </w:trPr>
+        <w:tc>
+          <w:tcPr>
+            <w:tcW w:type="dxa" w:w="9024"/>
+            <w:gridSpan w:val="12"/>
+            <w:vMerge/>
+          </w:tcPr>
+          <w:p/>
+        </w:tc>
+      </w:tr>
+      <w:tr>
+        <w:trPr>
+          <w:trHeight w:val="420" w:hRule="atLeast"/>
+        </w:trPr>
+        <w:tc>
+          <w:tcPr>
+            <w:tcW w:type="dxa" w:w="9024"/>
+            <w:gridSpan w:val="12"/>
+            <w:vMerge/>
+          </w:tcPr>
+          <w:p/>
+        </w:tc>
+      </w:tr>
+      <w:tr>
+        <w:trPr>
+          <w:trHeight w:val="420" w:hRule="atLeast"/>
+        </w:trPr>
+        <w:tc>
+          <w:tcPr>
+            <w:tcW w:type="dxa" w:w="9024"/>
+            <w:gridSpan w:val="12"/>
+            <w:vMerge/>
+          </w:tcPr>
+          <w:p/>
+        </w:tc>
+      </w:tr>
+      <w:tr>
+        <w:trPr>
+          <w:trHeight w:val="420" w:hRule="atLeast"/>
+        </w:trPr>
+        <w:tc>
+          <w:tcPr>
+            <w:tcW w:type="dxa" w:w="4512"/>
+            <w:gridSpan w:val="6"/>
+            <w:vMerge w:val="restart"/>
+            <w:tcMar>
+              <w:top w:w="20" w:type="dxa"/>
+              <w:left w:w="60" w:type="dxa"/>
+              <w:bottom w:w="20" w:type="dxa"/>
+              <w:right w:w="60" w:type="dxa"/>
+            </w:tcMar>
+            <w:vAlign w:val="top"/>
+          </w:tcPr>
+          <w:p>
+            <w:pPr>
+              <w:spacing w:after="0"/>
+              <w:jc w:val="left"/>
+            </w:pPr>
+            <w:hyperlink r:id="rId12">
+              <w:r>
+                <w:rPr>
+                  <w:b/>
+                  <w:color w:val="FFFFFF"/>
+                  <w:sz w:val="19"/>
+                  <w:shd w:val="clear" w:color="auto" w:fill="1F4E78"/>
+                </w:rPr>
+                <w:t xml:space="preserve">   View details   </w:t>
+              </w:r>
+            </w:hyperlink>
+          </w:p>
+        </w:tc>
+        <w:tc>
+          <w:tcPr>
+            <w:tcW w:type="dxa" w:w="752"/>
+          </w:tcPr>
+          <w:p/>
+        </w:tc>
+        <w:tc>
+          <w:tcPr>
+            <w:tcW w:type="dxa" w:w="752"/>
+          </w:tcPr>
+          <w:p/>
+        </w:tc>
+        <w:tc>
+          <w:tcPr>
+            <w:tcW w:type="dxa" w:w="752"/>
+          </w:tcPr>
+          <w:p/>
+        </w:tc>
+        <w:tc>
+          <w:tcPr>
+            <w:tcW w:type="dxa" w:w="752"/>
+          </w:tcPr>
+          <w:p/>
+        </w:tc>
+        <w:tc>
+          <w:tcPr>
+            <w:tcW w:type="dxa" w:w="752"/>
+          </w:tcPr>
+          <w:p/>
+        </w:tc>
+        <w:tc>
+          <w:tcPr>
+            <w:tcW w:type="dxa" w:w="752"/>
+          </w:tcPr>
+          <w:p/>
+        </w:tc>
+      </w:tr>
+      <w:tr>
+        <w:trPr>
+          <w:trHeight w:val="420" w:hRule="atLeast"/>
+        </w:trPr>
+        <w:tc>
+          <w:tcPr>
+            <w:tcW w:type="dxa" w:w="4512"/>
+            <w:gridSpan w:val="6"/>
+            <w:vMerge/>
+          </w:tcPr>
+          <w:p/>
+        </w:tc>
+        <w:tc>
+          <w:tcPr>
+            <w:tcW w:type="dxa" w:w="752"/>
+          </w:tcPr>
+          <w:p/>
+        </w:tc>
+        <w:tc>
+          <w:tcPr>
+            <w:tcW w:type="dxa" w:w="752"/>
+          </w:tcPr>
+          <w:p/>
+        </w:tc>
+        <w:tc>
+          <w:tcPr>
+            <w:tcW w:type="dxa" w:w="752"/>
+          </w:tcPr>
+          <w:p/>
+        </w:tc>
+        <w:tc>
+          <w:tcPr>
+            <w:tcW w:type="dxa" w:w="752"/>
+          </w:tcPr>
+          <w:p/>
+        </w:tc>
+        <w:tc>
+          <w:tcPr>
+            <w:tcW w:type="dxa" w:w="752"/>
+          </w:tcPr>
+          <w:p/>
+        </w:tc>
+        <w:tc>
+          <w:tcPr>
+            <w:tcW w:type="dxa" w:w="752"/>
+          </w:tcPr>
+          <w:p/>
+        </w:tc>
+      </w:tr>
+    </w:tbl>
     <w:p>
       <w:pPr>
-        <w:spacing w:after="100" w:line="288" w:lineRule="auto"/>
-        <w:jc w:val="left"/>
-      </w:pPr>
-      <w:r>
-        <w:rPr>
-          <w:b/>
-          <w:i w:val="0"/>
-          <w:color w:val="1F4E78"/>
-          <w:sz w:val="34"/>
-        </w:rPr>
-        <w:t>Global Hackathon Championship 2026</w:t>
-      </w:r>
-    </w:p>
-    <w:p>
-      <w:pPr>
-        <w:spacing w:after="100"/>
-      </w:pPr>
-      <w:r>
-        <w:rPr>
-          <w:b/>
-          <w:i w:val="0"/>
-          <w:color w:val="475569"/>
-          <w:sz w:val="21"/>
-        </w:rPr>
-        <w:t>By Rohan Sharma, Anita Roy, Kevin Patel</w:t>
-      </w:r>
-    </w:p>
-    <w:p>
-      <w:pPr>
-        <w:spacing w:after="160" w:line="384" w:lineRule="auto"/>
-        <w:jc w:val="left"/>
-      </w:pPr>
-      <w:r>
-        <w:rPr>
-          <w:b w:val="0"/>
-          <w:i w:val="0"/>
-          <w:color w:val="334155"/>
-          <w:sz w:val="21"/>
-        </w:rPr>
-        <w:t>Secured 1st rank out of 350 international teams for constructing an autonomous AI disaster response drone dispatch dashboard.</w:t>
-      </w:r>
-    </w:p>
-    <w:p>
-      <w:pPr>
-        <w:spacing w:after="160"/>
-      </w:pPr>
-      <w:hyperlink r:id="rId12">
-        <w:r>
-          <w:rPr>
-            <w:b/>
-            <w:color w:val="FFFFFF"/>
-            <w:sz w:val="19"/>
-            <w:shd w:val="clear" w:color="auto" w:fill="1F4E78"/>
-          </w:rPr>
-          <w:t xml:space="preserve">   View details   </w:t>
-        </w:r>
-      </w:hyperlink>
-    </w:p>
-    <w:p>
-      <w:pPr>
-        <w:spacing w:before="200" w:after="200"/>
         <w:pBdr>
           <w:bottom w:val="single" w:sz="6" w:space="1" w:color="D9DEE4"/>
         </w:pBdr>
+        <w:spacing w:before="200" w:after="200"/>
       </w:pPr>
     </w:p>
-    <w:p>
-      <w:pPr>
-        <w:spacing w:after="100" w:line="288" w:lineRule="auto"/>
+    <w:tbl>
+      <w:tblPr>
+        <w:tblW w:type="auto" w:w="0"/>
         <w:jc w:val="left"/>
-      </w:pPr>
-      <w:r>
-        <w:rPr>
-          <w:b/>
-          <w:i w:val="0"/>
-          <w:color w:val="1F4E78"/>
-          <w:sz w:val="34"/>
-        </w:rPr>
-        <w:t>National AI Hackathon 2026</w:t>
-      </w:r>
-    </w:p>
-    <w:p>
-      <w:pPr>
-        <w:spacing w:after="100"/>
-      </w:pPr>
-      <w:r>
-        <w:rPr>
-          <w:b/>
-          <w:i w:val="0"/>
-          <w:color w:val="475569"/>
-          <w:sz w:val="21"/>
-        </w:rPr>
-        <w:t>By Rohan Sharma, Anita Roy</w:t>
-      </w:r>
-    </w:p>
-    <w:p>
-      <w:pPr>
-        <w:spacing w:after="160" w:line="384" w:lineRule="auto"/>
-        <w:jc w:val="left"/>
-      </w:pPr>
-      <w:r>
-        <w:rPr>
-          <w:b w:val="0"/>
-          <w:i w:val="0"/>
-          <w:color w:val="334155"/>
-          <w:sz w:val="21"/>
-        </w:rPr>
-        <w:t>Built an automated newsletter builder platform using document transformation engines.</w:t>
-      </w:r>
-    </w:p>
+        <w:tblLayout w:type="fixed"/>
+        <w:tblLook w:firstColumn="1" w:firstRow="1" w:lastColumn="0" w:lastRow="0" w:noHBand="0" w:noVBand="1" w:val="04A0"/>
+      </w:tblPr>
+      <w:tblGrid>
+        <w:gridCol w:w="752"/>
+        <w:gridCol w:w="752"/>
+        <w:gridCol w:w="752"/>
+        <w:gridCol w:w="752"/>
+        <w:gridCol w:w="752"/>
+        <w:gridCol w:w="752"/>
+        <w:gridCol w:w="752"/>
+        <w:gridCol w:w="752"/>
+        <w:gridCol w:w="752"/>
+        <w:gridCol w:w="752"/>
+        <w:gridCol w:w="752"/>
+        <w:gridCol w:w="752"/>
+      </w:tblGrid>
+      <w:tr>
+        <w:trPr>
+          <w:trHeight w:val="420" w:hRule="atLeast"/>
+        </w:trPr>
+        <w:tc>
+          <w:tcPr>
+            <w:tcW w:type="dxa" w:w="9024"/>
+            <w:gridSpan w:val="12"/>
+            <w:vMerge w:val="restart"/>
+            <w:tcMar>
+              <w:top w:w="20" w:type="dxa"/>
+              <w:left w:w="60" w:type="dxa"/>
+              <w:bottom w:w="20" w:type="dxa"/>
+              <w:right w:w="60" w:type="dxa"/>
+            </w:tcMar>
+            <w:vAlign w:val="top"/>
+          </w:tcPr>
+          <w:p>
+            <w:pPr>
+              <w:spacing w:line="288" w:lineRule="auto" w:after="0"/>
+              <w:jc w:val="left"/>
+            </w:pPr>
+            <w:r>
+              <w:rPr>
+                <w:b/>
+                <w:i w:val="0"/>
+                <w:color w:val="1F4E78"/>
+                <w:sz w:val="34"/>
+              </w:rPr>
+              <w:t>National AI Hackathon 2026</w:t>
+            </w:r>
+          </w:p>
+        </w:tc>
+      </w:tr>
+      <w:tr>
+        <w:trPr>
+          <w:trHeight w:val="420" w:hRule="atLeast"/>
+        </w:trPr>
+        <w:tc>
+          <w:tcPr>
+            <w:tcW w:type="dxa" w:w="9024"/>
+            <w:gridSpan w:val="12"/>
+            <w:vMerge/>
+          </w:tcPr>
+          <w:p/>
+        </w:tc>
+      </w:tr>
+      <w:tr>
+        <w:trPr>
+          <w:trHeight w:val="420" w:hRule="atLeast"/>
+        </w:trPr>
+        <w:tc>
+          <w:tcPr>
+            <w:tcW w:type="dxa" w:w="9024"/>
+            <w:gridSpan w:val="12"/>
+            <w:vMerge/>
+          </w:tcPr>
+          <w:p/>
+        </w:tc>
+      </w:tr>
+      <w:tr>
+        <w:trPr>
+          <w:trHeight w:val="420" w:hRule="atLeast"/>
+        </w:trPr>
+        <w:tc>
+          <w:tcPr>
+            <w:tcW w:type="dxa" w:w="9024"/>
+            <w:gridSpan w:val="12"/>
+            <w:tcMar>
+              <w:top w:w="20" w:type="dxa"/>
+              <w:left w:w="60" w:type="dxa"/>
+              <w:bottom w:w="20" w:type="dxa"/>
+              <w:right w:w="60" w:type="dxa"/>
+            </w:tcMar>
+            <w:vAlign w:val="top"/>
+          </w:tcPr>
+          <w:p>
+            <w:pPr>
+              <w:spacing w:after="0"/>
+              <w:jc w:val="left"/>
+            </w:pPr>
+            <w:r>
+              <w:rPr>
+                <w:b/>
+                <w:i w:val="0"/>
+                <w:color w:val="475569"/>
+                <w:sz w:val="21"/>
+              </w:rPr>
+              <w:t>By Rohan Sharma, Anita Roy</w:t>
+            </w:r>
+          </w:p>
+        </w:tc>
+      </w:tr>
+      <w:tr>
+        <w:trPr>
+          <w:trHeight w:val="420" w:hRule="atLeast"/>
+        </w:trPr>
+        <w:tc>
+          <w:tcPr>
+            <w:tcW w:type="dxa" w:w="9024"/>
+            <w:gridSpan w:val="12"/>
+            <w:vMerge w:val="restart"/>
+            <w:tcMar>
+              <w:top w:w="20" w:type="dxa"/>
+              <w:left w:w="60" w:type="dxa"/>
+              <w:bottom w:w="20" w:type="dxa"/>
+              <w:right w:w="60" w:type="dxa"/>
+            </w:tcMar>
+            <w:vAlign w:val="top"/>
+          </w:tcPr>
+          <w:p>
+            <w:pPr>
+              <w:spacing w:line="360" w:lineRule="auto" w:after="0"/>
+              <w:jc w:val="left"/>
+            </w:pPr>
+            <w:r>
+              <w:rPr>
+                <w:b w:val="0"/>
+                <w:i w:val="0"/>
+                <w:color w:val="334155"/>
+                <w:sz w:val="21"/>
+              </w:rPr>
+              <w:t>Built an automated newsletter builder platform using document transformation engines.</w:t>
+            </w:r>
+          </w:p>
+        </w:tc>
+      </w:tr>
+      <w:tr>
+        <w:trPr>
+          <w:trHeight w:val="420" w:hRule="atLeast"/>
+        </w:trPr>
+        <w:tc>
+          <w:tcPr>
+            <w:tcW w:type="dxa" w:w="9024"/>
+            <w:gridSpan w:val="12"/>
+            <w:vMerge/>
+          </w:tcPr>
+          <w:p/>
+        </w:tc>
+      </w:tr>
+      <w:tr>
+        <w:trPr>
+          <w:trHeight w:val="420" w:hRule="atLeast"/>
+        </w:trPr>
+        <w:tc>
+          <w:tcPr>
+            <w:tcW w:type="dxa" w:w="9024"/>
+            <w:gridSpan w:val="12"/>
+            <w:vMerge/>
+          </w:tcPr>
+          <w:p/>
+        </w:tc>
+      </w:tr>
+      <w:tr>
+        <w:trPr>
+          <w:trHeight w:val="420" w:hRule="atLeast"/>
+        </w:trPr>
+        <w:tc>
+          <w:tcPr>
+            <w:tcW w:type="dxa" w:w="9024"/>
+            <w:gridSpan w:val="12"/>
+            <w:vMerge/>
+          </w:tcPr>
+          <w:p/>
+        </w:tc>
+      </w:tr>
+      <w:tr>
+        <w:trPr>
+          <w:trHeight w:val="420" w:hRule="atLeast"/>
+        </w:trPr>
+        <w:tc>
+          <w:tcPr>
+            <w:tcW w:type="dxa" w:w="9024"/>
+            <w:gridSpan w:val="12"/>
+            <w:vMerge/>
+          </w:tcPr>
+          <w:p/>
+        </w:tc>
+      </w:tr>
+      <w:tr>
+        <w:trPr>
+          <w:trHeight w:val="420" w:hRule="atLeast"/>
+        </w:trPr>
+        <w:tc>
+          <w:tcPr>
+            <w:tcW w:type="dxa" w:w="9024"/>
+            <w:gridSpan w:val="12"/>
+            <w:vMerge/>
+          </w:tcPr>
+          <w:p/>
+        </w:tc>
+      </w:tr>
+    </w:tbl>
     <w:sectPr>
       <w:pgSz w:w="11909" w:h="16834"/>
       <w:pgMar w:top="1152" w:right="1440" w:bottom="1152" w:left="1440" w:header="720" w:footer="720" w:gutter="0"/>

</xml_diff>